<commit_message>
Add figure callouts and refresh PMOS materials
</commit_message>
<xml_diff>
--- a/tables/descriptives_table.docx
+++ b/tables/descriptives_table.docx
@@ -396,7 +396,7 @@
                 <w:szCs w:val="20"/>
                 <w:color w:val="000000"/>
               </w:rPr>
-              <w:t xml:space="preserve">†</w:t>
+              <w:t xml:space="preserve">b</w:t>
             </w:r>
           </w:p>
         </w:tc>
@@ -464,7 +464,7 @@
                 <w:szCs w:val="20"/>
                 <w:color w:val="000000"/>
               </w:rPr>
-              <w:t xml:space="preserve">†*</w:t>
+              <w:t xml:space="preserve">b</w:t>
             </w:r>
           </w:p>
         </w:tc>
@@ -532,7 +532,7 @@
                 <w:szCs w:val="20"/>
                 <w:color w:val="000000"/>
               </w:rPr>
-              <w:t xml:space="preserve">†*</w:t>
+              <w:t xml:space="preserve">b</w:t>
             </w:r>
           </w:p>
         </w:tc>
@@ -600,7 +600,7 @@
                 <w:szCs w:val="20"/>
                 <w:color w:val="000000"/>
               </w:rPr>
-              <w:t xml:space="preserve">†*</w:t>
+              <w:t xml:space="preserve">b</w:t>
             </w:r>
           </w:p>
         </w:tc>
@@ -668,7 +668,7 @@
                 <w:szCs w:val="20"/>
                 <w:color w:val="000000"/>
               </w:rPr>
-              <w:t xml:space="preserve">†</w:t>
+              <w:t xml:space="preserve">b</w:t>
             </w:r>
           </w:p>
         </w:tc>
@@ -736,7 +736,7 @@
                 <w:szCs w:val="20"/>
                 <w:color w:val="000000"/>
               </w:rPr>
-              <w:t xml:space="preserve">†</w:t>
+              <w:t xml:space="preserve">b</w:t>
             </w:r>
           </w:p>
         </w:tc>
@@ -2868,7 +2868,7 @@
                 <w:szCs w:val="16"/>
                 <w:color w:val="000000"/>
               </w:rPr>
-              <w:t xml:space="preserve">PCOS</w:t>
+              <w:t xml:space="preserve">PMOS</w:t>
             </w:r>
           </w:p>
         </w:tc>
@@ -3740,7 +3740,7 @@
                 <w:szCs w:val="16"/>
                 <w:color w:val="000000"/>
               </w:rPr>
-              <w:t xml:space="preserve">PCOS</w:t>
+              <w:t xml:space="preserve">PMOS</w:t>
             </w:r>
           </w:p>
         </w:tc>
@@ -6384,7 +6384,7 @@
                 <w:szCs w:val="16"/>
                 <w:color w:val="000000"/>
               </w:rPr>
-              <w:t xml:space="preserve">PCOS</w:t>
+              <w:t xml:space="preserve">PMOS</w:t>
             </w:r>
           </w:p>
         </w:tc>
@@ -7282,7 +7282,7 @@
                 <w:szCs w:val="16"/>
                 <w:color w:val="000000"/>
               </w:rPr>
-              <w:t xml:space="preserve">PCOS</w:t>
+              <w:t xml:space="preserve">PMOS</w:t>
             </w:r>
           </w:p>
         </w:tc>
@@ -8128,7 +8128,7 @@
                 <w:szCs w:val="16"/>
                 <w:color w:val="000000"/>
               </w:rPr>
-              <w:t xml:space="preserve">PCOS</w:t>
+              <w:t xml:space="preserve">PMOS</w:t>
             </w:r>
           </w:p>
         </w:tc>
@@ -8998,7 +8998,7 @@
                 <w:szCs w:val="16"/>
                 <w:color w:val="000000"/>
               </w:rPr>
-              <w:t xml:space="preserve">PCOS</w:t>
+              <w:t xml:space="preserve">PMOS</w:t>
             </w:r>
           </w:p>
         </w:tc>
@@ -9897,7 +9897,7 @@
                 <w:szCs w:val="16"/>
                 <w:color w:val="000000"/>
               </w:rPr>
-              <w:t xml:space="preserve">PCOS</w:t>
+              <w:t xml:space="preserve">PMOS</w:t>
             </w:r>
           </w:p>
         </w:tc>
@@ -11669,7 +11669,7 @@
                 <w:szCs w:val="16"/>
                 <w:color w:val="000000"/>
               </w:rPr>
-              <w:t xml:space="preserve">PCOS</w:t>
+              <w:t xml:space="preserve">PMOS</w:t>
             </w:r>
           </w:p>
         </w:tc>
@@ -13441,7 +13441,7 @@
                 <w:szCs w:val="16"/>
                 <w:color w:val="000000"/>
               </w:rPr>
-              <w:t xml:space="preserve">PCOS</w:t>
+              <w:t xml:space="preserve">PMOS</w:t>
             </w:r>
           </w:p>
         </w:tc>
@@ -14314,7 +14314,7 @@
                 <w:szCs w:val="16"/>
                 <w:color w:val="000000"/>
               </w:rPr>
-              <w:t xml:space="preserve">PCOS</w:t>
+              <w:t xml:space="preserve">PMOS</w:t>
             </w:r>
           </w:p>
         </w:tc>
@@ -16086,7 +16086,7 @@
                 <w:szCs w:val="16"/>
                 <w:color w:val="000000"/>
               </w:rPr>
-              <w:t xml:space="preserve">PCOS</w:t>
+              <w:t xml:space="preserve">PMOS</w:t>
             </w:r>
           </w:p>
         </w:tc>
@@ -17858,7 +17858,7 @@
                 <w:szCs w:val="16"/>
                 <w:color w:val="000000"/>
               </w:rPr>
-              <w:t xml:space="preserve">PCOS</w:t>
+              <w:t xml:space="preserve">PMOS</w:t>
             </w:r>
           </w:p>
         </w:tc>
@@ -19574,7 +19574,7 @@
                 <w:szCs w:val="16"/>
                 <w:color w:val="000000"/>
               </w:rPr>
-              <w:t xml:space="preserve">PCOS</w:t>
+              <w:t xml:space="preserve">PMOS</w:t>
             </w:r>
           </w:p>
         </w:tc>
@@ -20446,7 +20446,7 @@
                 <w:szCs w:val="16"/>
                 <w:color w:val="000000"/>
               </w:rPr>
-              <w:t xml:space="preserve">PCOS</w:t>
+              <w:t xml:space="preserve">PMOS</w:t>
             </w:r>
           </w:p>
         </w:tc>
@@ -21292,7 +21292,7 @@
                 <w:szCs w:val="16"/>
                 <w:color w:val="000000"/>
               </w:rPr>
-              <w:t xml:space="preserve">PCOS</w:t>
+              <w:t xml:space="preserve">PMOS</w:t>
             </w:r>
           </w:p>
         </w:tc>
@@ -23010,7 +23010,7 @@
                 <w:szCs w:val="16"/>
                 <w:color w:val="000000"/>
               </w:rPr>
-              <w:t xml:space="preserve">PCOS</w:t>
+              <w:t xml:space="preserve">PMOS</w:t>
             </w:r>
           </w:p>
         </w:tc>
@@ -24728,7 +24728,7 @@
                 <w:szCs w:val="16"/>
                 <w:color w:val="000000"/>
               </w:rPr>
-              <w:t xml:space="preserve">PCOS</w:t>
+              <w:t xml:space="preserve">PMOS</w:t>
             </w:r>
           </w:p>
         </w:tc>
@@ -26444,7 +26444,7 @@
                 <w:szCs w:val="16"/>
                 <w:color w:val="000000"/>
               </w:rPr>
-              <w:t xml:space="preserve">PCOS</w:t>
+              <w:t xml:space="preserve">PMOS</w:t>
             </w:r>
           </w:p>
         </w:tc>
@@ -27341,7 +27341,7 @@
                 <w:szCs w:val="16"/>
                 <w:color w:val="000000"/>
               </w:rPr>
-              <w:t xml:space="preserve">PCOS</w:t>
+              <w:t xml:space="preserve">PMOS</w:t>
             </w:r>
           </w:p>
         </w:tc>
@@ -28240,7 +28240,7 @@
                 <w:szCs w:val="16"/>
                 <w:color w:val="000000"/>
               </w:rPr>
-              <w:t xml:space="preserve">PCOS</w:t>
+              <w:t xml:space="preserve">PMOS</w:t>
             </w:r>
           </w:p>
         </w:tc>
@@ -29863,7 +29863,7 @@
                 <w:szCs w:val="22"/>
                 <w:color w:val="000000"/>
               </w:rPr>
-              <w:t xml:space="preserve">PCOS = polycystic ovary syndrome; BMI = body mass index; OGTT = oral glucose tolerance test; HOMA-IR = homeostatic model assessment of insulin resistance</w:t>
+              <w:t xml:space="preserve">PMOS = polyendocrine metabolic ovarian syndrome; BMI = body mass index; OGTT = oral glucose tolerance test; HOMA-IR = homeostatic model assessment of insulin resistance</w:t>
             </w:r>
           </w:p>
         </w:tc>
@@ -29925,7 +29925,7 @@
                 <w:szCs w:val="22"/>
                 <w:color w:val="000000"/>
               </w:rPr>
-              <w:t xml:space="preserve">†</w:t>
+              <w:t xml:space="preserve">b</w:t>
             </w:r>
             <w:r>
               <w:rPr>
@@ -30000,7 +30000,7 @@
                 <w:szCs w:val="22"/>
                 <w:color w:val="000000"/>
               </w:rPr>
-              <w:t xml:space="preserve">†*</w:t>
+              <w:t xml:space="preserve">b</w:t>
             </w:r>
             <w:r>
               <w:rPr>

</xml_diff>

<commit_message>
Finalize supplementary publishing workflow
</commit_message>
<xml_diff>
--- a/tables/descriptives_table.docx
+++ b/tables/descriptives_table.docx
@@ -396,7 +396,7 @@
                 <w:szCs w:val="20"/>
                 <w:color w:val="000000"/>
               </w:rPr>
-              <w:t xml:space="preserve">b</w:t>
+              <w:t xml:space="preserve">†</w:t>
             </w:r>
           </w:p>
         </w:tc>
@@ -464,7 +464,7 @@
                 <w:szCs w:val="20"/>
                 <w:color w:val="000000"/>
               </w:rPr>
-              <w:t xml:space="preserve">b</w:t>
+              <w:t xml:space="preserve">†*</w:t>
             </w:r>
           </w:p>
         </w:tc>
@@ -532,7 +532,7 @@
                 <w:szCs w:val="20"/>
                 <w:color w:val="000000"/>
               </w:rPr>
-              <w:t xml:space="preserve">b</w:t>
+              <w:t xml:space="preserve">†*</w:t>
             </w:r>
           </w:p>
         </w:tc>
@@ -600,7 +600,7 @@
                 <w:szCs w:val="20"/>
                 <w:color w:val="000000"/>
               </w:rPr>
-              <w:t xml:space="preserve">b</w:t>
+              <w:t xml:space="preserve">†*</w:t>
             </w:r>
           </w:p>
         </w:tc>
@@ -668,7 +668,7 @@
                 <w:szCs w:val="20"/>
                 <w:color w:val="000000"/>
               </w:rPr>
-              <w:t xml:space="preserve">b</w:t>
+              <w:t xml:space="preserve">†</w:t>
             </w:r>
           </w:p>
         </w:tc>
@@ -736,7 +736,7 @@
                 <w:szCs w:val="20"/>
                 <w:color w:val="000000"/>
               </w:rPr>
-              <w:t xml:space="preserve">b</w:t>
+              <w:t xml:space="preserve">†</w:t>
             </w:r>
           </w:p>
         </w:tc>
@@ -29925,7 +29925,7 @@
                 <w:szCs w:val="22"/>
                 <w:color w:val="000000"/>
               </w:rPr>
-              <w:t xml:space="preserve">b</w:t>
+              <w:t xml:space="preserve">†</w:t>
             </w:r>
             <w:r>
               <w:rPr>
@@ -30000,7 +30000,7 @@
                 <w:szCs w:val="22"/>
                 <w:color w:val="000000"/>
               </w:rPr>
-              <w:t xml:space="preserve">b</w:t>
+              <w:t xml:space="preserve">†*</w:t>
             </w:r>
             <w:r>
               <w:rPr>

</xml_diff>